<commit_message>
Add alloys section to Valve and Bushes reports
Co-Authored-By: Claude Sonnet 5.5 <noreply@anthropic.com>
Claude-Session: https://claude.ai/code/session_016W9Vc593kx2CExTJx8qeMZ
</commit_message>
<xml_diff>
--- a/reports/Bushes_Industry_Report_Bajaj_Alloys.docx
+++ b/reports/Bushes_Industry_Report_Bajaj_Alloys.docx
@@ -108,7 +108,7 @@
         <w:pStyle w:val="ListBullet"/>
       </w:pPr>
       <w:r>
-        <w:t>4. Materials</w:t>
+        <w:t>4. Alloys used in making bushes</w:t>
       </w:r>
     </w:p>
     <w:p>
@@ -1651,7 +1651,26 @@
         <w:rPr>
           <w:color w:val="1F2A44"/>
         </w:rPr>
-        <w:t>4. Materials</w:t>
+        <w:t>4. Alloys used in making bushes</w:t>
+      </w:r>
+    </w:p>
+    <w:p>
+      <w:pPr>
+        <w:spacing w:after="120"/>
+      </w:pPr>
+      <w:r>
+        <w:t>A bush alloy must be softer than the shaft, hold a lubricant film, resist wear, seizure and fatigue, and carry load at the working speed. Copper-base alloys are the standard choice. Lead gives a self-lubricating, anti-seizure effect, tin adds strength and wear resistance, and aluminium and manganese add load capacity. Grades are quoted as UNS/SAE with indicative Indian designations; confirm the IS grade before certifying. Compositions are nominal percentages.</w:t>
+      </w:r>
+    </w:p>
+    <w:p>
+      <w:pPr>
+        <w:pStyle w:val="Heading2"/>
+      </w:pPr>
+      <w:r>
+        <w:rPr>
+          <w:color w:val="B8860B"/>
+        </w:rPr>
+        <w:t>4.1 Copper alloys for bushes</w:t>
       </w:r>
     </w:p>
     <w:p>
@@ -1660,7 +1679,1547 @@
           <w:b/>
           <w:sz w:val="18"/>
         </w:rPr>
-        <w:t>Table 4: Copper alloys for bushes</w:t>
+        <w:t>Table 4: Copper alloys used for bushes (nominal values)</w:t>
+      </w:r>
+    </w:p>
+    <w:tbl>
+      <w:tblPr>
+        <w:tblStyle w:val="TableGrid"/>
+        <w:tblW w:type="auto" w:w="0"/>
+        <w:jc w:val="center"/>
+        <w:tblLook w:firstColumn="1" w:firstRow="1" w:lastColumn="0" w:lastRow="0" w:noHBand="0" w:noVBand="1" w:val="04A0"/>
+      </w:tblPr>
+      <w:tblGrid>
+        <w:gridCol w:w="1930"/>
+        <w:gridCol w:w="1930"/>
+        <w:gridCol w:w="1930"/>
+        <w:gridCol w:w="1930"/>
+        <w:gridCol w:w="1930"/>
+      </w:tblGrid>
+      <w:tr>
+        <w:tc>
+          <w:tcPr>
+            <w:tcW w:type="dxa" w:w="1930"/>
+            <w:shd w:val="clear" w:color="auto" w:fill="1F2A44"/>
+          </w:tcPr>
+          <w:p>
+            <w:r/>
+            <w:r>
+              <w:rPr>
+                <w:b/>
+                <w:color w:val="FFFFFF"/>
+                <w:sz w:val="18"/>
+              </w:rPr>
+              <w:t>Alloy family</w:t>
+            </w:r>
+          </w:p>
+        </w:tc>
+        <w:tc>
+          <w:tcPr>
+            <w:tcW w:type="dxa" w:w="1930"/>
+            <w:shd w:val="clear" w:color="auto" w:fill="1F2A44"/>
+          </w:tcPr>
+          <w:p>
+            <w:r/>
+            <w:r>
+              <w:rPr>
+                <w:b/>
+                <w:color w:val="FFFFFF"/>
+                <w:sz w:val="18"/>
+              </w:rPr>
+              <w:t>Grade (UNS / SAE / IS)</w:t>
+            </w:r>
+          </w:p>
+        </w:tc>
+        <w:tc>
+          <w:tcPr>
+            <w:tcW w:type="dxa" w:w="1930"/>
+            <w:shd w:val="clear" w:color="auto" w:fill="1F2A44"/>
+          </w:tcPr>
+          <w:p>
+            <w:r/>
+            <w:r>
+              <w:rPr>
+                <w:b/>
+                <w:color w:val="FFFFFF"/>
+                <w:sz w:val="18"/>
+              </w:rPr>
+              <w:t>Nominal composition (%)</w:t>
+            </w:r>
+          </w:p>
+        </w:tc>
+        <w:tc>
+          <w:tcPr>
+            <w:tcW w:type="dxa" w:w="1930"/>
+            <w:shd w:val="clear" w:color="auto" w:fill="1F2A44"/>
+          </w:tcPr>
+          <w:p>
+            <w:r/>
+            <w:r>
+              <w:rPr>
+                <w:b/>
+                <w:color w:val="FFFFFF"/>
+                <w:sz w:val="18"/>
+              </w:rPr>
+              <w:t>Typical properties</w:t>
+            </w:r>
+          </w:p>
+        </w:tc>
+        <w:tc>
+          <w:tcPr>
+            <w:tcW w:type="dxa" w:w="1930"/>
+            <w:shd w:val="clear" w:color="auto" w:fill="1F2A44"/>
+          </w:tcPr>
+          <w:p>
+            <w:r/>
+            <w:r>
+              <w:rPr>
+                <w:b/>
+                <w:color w:val="FFFFFF"/>
+                <w:sz w:val="18"/>
+              </w:rPr>
+              <w:t>Typical bushes / applications</w:t>
+            </w:r>
+          </w:p>
+        </w:tc>
+      </w:tr>
+      <w:tr>
+        <w:tc>
+          <w:tcPr>
+            <w:tcW w:type="dxa" w:w="1930"/>
+          </w:tcPr>
+          <w:p>
+            <w:r/>
+            <w:r>
+              <w:rPr>
+                <w:sz w:val="18"/>
+              </w:rPr>
+              <w:t>Leaded gunmetal</w:t>
+            </w:r>
+          </w:p>
+        </w:tc>
+        <w:tc>
+          <w:tcPr>
+            <w:tcW w:type="dxa" w:w="1930"/>
+          </w:tcPr>
+          <w:p>
+            <w:r/>
+            <w:r>
+              <w:rPr>
+                <w:sz w:val="18"/>
+              </w:rPr>
+              <w:t>C83600 (85-5-5-5) / IS 318 LTB2</w:t>
+            </w:r>
+          </w:p>
+        </w:tc>
+        <w:tc>
+          <w:tcPr>
+            <w:tcW w:type="dxa" w:w="1930"/>
+          </w:tcPr>
+          <w:p>
+            <w:r/>
+            <w:r>
+              <w:rPr>
+                <w:sz w:val="18"/>
+              </w:rPr>
+              <w:t>Cu 85, Sn 5, Pb 5, Zn 5</w:t>
+            </w:r>
+          </w:p>
+        </w:tc>
+        <w:tc>
+          <w:tcPr>
+            <w:tcW w:type="dxa" w:w="1930"/>
+          </w:tcPr>
+          <w:p>
+            <w:r/>
+            <w:r>
+              <w:rPr>
+                <w:sz w:val="18"/>
+              </w:rPr>
+              <w:t>Hardness about 60 HB; good machining, medium load</w:t>
+            </w:r>
+          </w:p>
+        </w:tc>
+        <w:tc>
+          <w:tcPr>
+            <w:tcW w:type="dxa" w:w="1930"/>
+          </w:tcPr>
+          <w:p>
+            <w:r/>
+            <w:r>
+              <w:rPr>
+                <w:sz w:val="18"/>
+              </w:rPr>
+              <w:t>Pump, valve, general machinery bushes</w:t>
+            </w:r>
+          </w:p>
+        </w:tc>
+      </w:tr>
+      <w:tr>
+        <w:tc>
+          <w:tcPr>
+            <w:tcW w:type="dxa" w:w="1930"/>
+            <w:shd w:val="clear" w:color="auto" w:fill="F3EEDC"/>
+          </w:tcPr>
+          <w:p>
+            <w:r/>
+            <w:r>
+              <w:rPr>
+                <w:sz w:val="18"/>
+              </w:rPr>
+              <w:t>Leaded tin bronze (SAE 660)</w:t>
+            </w:r>
+          </w:p>
+        </w:tc>
+        <w:tc>
+          <w:tcPr>
+            <w:tcW w:type="dxa" w:w="1930"/>
+            <w:shd w:val="clear" w:color="auto" w:fill="F3EEDC"/>
+          </w:tcPr>
+          <w:p>
+            <w:r/>
+            <w:r>
+              <w:rPr>
+                <w:sz w:val="18"/>
+              </w:rPr>
+              <w:t>C93200 / SAE 660</w:t>
+            </w:r>
+          </w:p>
+        </w:tc>
+        <w:tc>
+          <w:tcPr>
+            <w:tcW w:type="dxa" w:w="1930"/>
+            <w:shd w:val="clear" w:color="auto" w:fill="F3EEDC"/>
+          </w:tcPr>
+          <w:p>
+            <w:r/>
+            <w:r>
+              <w:rPr>
+                <w:sz w:val="18"/>
+              </w:rPr>
+              <w:t>Cu 83, Sn 7, Pb 7, Zn 3</w:t>
+            </w:r>
+          </w:p>
+        </w:tc>
+        <w:tc>
+          <w:tcPr>
+            <w:tcW w:type="dxa" w:w="1930"/>
+            <w:shd w:val="clear" w:color="auto" w:fill="F3EEDC"/>
+          </w:tcPr>
+          <w:p>
+            <w:r/>
+            <w:r>
+              <w:rPr>
+                <w:sz w:val="18"/>
+              </w:rPr>
+              <w:t>Tensile about 250 MPa; hardness 65 to 70 HB</w:t>
+            </w:r>
+          </w:p>
+        </w:tc>
+        <w:tc>
+          <w:tcPr>
+            <w:tcW w:type="dxa" w:w="1930"/>
+            <w:shd w:val="clear" w:color="auto" w:fill="F3EEDC"/>
+          </w:tcPr>
+          <w:p>
+            <w:r/>
+            <w:r>
+              <w:rPr>
+                <w:sz w:val="18"/>
+              </w:rPr>
+              <w:t>General-purpose bearing bush, most common grade</w:t>
+            </w:r>
+          </w:p>
+        </w:tc>
+      </w:tr>
+      <w:tr>
+        <w:tc>
+          <w:tcPr>
+            <w:tcW w:type="dxa" w:w="1930"/>
+          </w:tcPr>
+          <w:p>
+            <w:r/>
+            <w:r>
+              <w:rPr>
+                <w:sz w:val="18"/>
+              </w:rPr>
+              <w:t>High-lead tin bronze</w:t>
+            </w:r>
+          </w:p>
+        </w:tc>
+        <w:tc>
+          <w:tcPr>
+            <w:tcW w:type="dxa" w:w="1930"/>
+          </w:tcPr>
+          <w:p>
+            <w:r/>
+            <w:r>
+              <w:rPr>
+                <w:sz w:val="18"/>
+              </w:rPr>
+              <w:t>C93700 / SAE 64</w:t>
+            </w:r>
+          </w:p>
+        </w:tc>
+        <w:tc>
+          <w:tcPr>
+            <w:tcW w:type="dxa" w:w="1930"/>
+          </w:tcPr>
+          <w:p>
+            <w:r/>
+            <w:r>
+              <w:rPr>
+                <w:sz w:val="18"/>
+              </w:rPr>
+              <w:t>Cu 80, Sn 10, Pb 10</w:t>
+            </w:r>
+          </w:p>
+        </w:tc>
+        <w:tc>
+          <w:tcPr>
+            <w:tcW w:type="dxa" w:w="1930"/>
+          </w:tcPr>
+          <w:p>
+            <w:r/>
+            <w:r>
+              <w:rPr>
+                <w:sz w:val="18"/>
+              </w:rPr>
+              <w:t>Hardness about 60 HB; excellent anti-seizure</w:t>
+            </w:r>
+          </w:p>
+        </w:tc>
+        <w:tc>
+          <w:tcPr>
+            <w:tcW w:type="dxa" w:w="1930"/>
+          </w:tcPr>
+          <w:p>
+            <w:r/>
+            <w:r>
+              <w:rPr>
+                <w:sz w:val="18"/>
+              </w:rPr>
+              <w:t>High-speed, moderate-load bushes: motors, engines, pumps</w:t>
+            </w:r>
+          </w:p>
+        </w:tc>
+      </w:tr>
+      <w:tr>
+        <w:tc>
+          <w:tcPr>
+            <w:tcW w:type="dxa" w:w="1930"/>
+            <w:shd w:val="clear" w:color="auto" w:fill="F3EEDC"/>
+          </w:tcPr>
+          <w:p>
+            <w:r/>
+            <w:r>
+              <w:rPr>
+                <w:sz w:val="18"/>
+              </w:rPr>
+              <w:t>Very high-lead bronze</w:t>
+            </w:r>
+          </w:p>
+        </w:tc>
+        <w:tc>
+          <w:tcPr>
+            <w:tcW w:type="dxa" w:w="1930"/>
+            <w:shd w:val="clear" w:color="auto" w:fill="F3EEDC"/>
+          </w:tcPr>
+          <w:p>
+            <w:r/>
+            <w:r>
+              <w:rPr>
+                <w:sz w:val="18"/>
+              </w:rPr>
+              <w:t>C93800 / C94300</w:t>
+            </w:r>
+          </w:p>
+        </w:tc>
+        <w:tc>
+          <w:tcPr>
+            <w:tcW w:type="dxa" w:w="1930"/>
+            <w:shd w:val="clear" w:color="auto" w:fill="F3EEDC"/>
+          </w:tcPr>
+          <w:p>
+            <w:r/>
+            <w:r>
+              <w:rPr>
+                <w:sz w:val="18"/>
+              </w:rPr>
+              <w:t>Cu 78 to 70, Sn 7 to 5, Pb 15 to 25</w:t>
+            </w:r>
+          </w:p>
+        </w:tc>
+        <w:tc>
+          <w:tcPr>
+            <w:tcW w:type="dxa" w:w="1930"/>
+            <w:shd w:val="clear" w:color="auto" w:fill="F3EEDC"/>
+          </w:tcPr>
+          <w:p>
+            <w:r/>
+            <w:r>
+              <w:rPr>
+                <w:sz w:val="18"/>
+              </w:rPr>
+              <w:t>Soft, very good for poor lubrication</w:t>
+            </w:r>
+          </w:p>
+        </w:tc>
+        <w:tc>
+          <w:tcPr>
+            <w:tcW w:type="dxa" w:w="1930"/>
+            <w:shd w:val="clear" w:color="auto" w:fill="F3EEDC"/>
+          </w:tcPr>
+          <w:p>
+            <w:r/>
+            <w:r>
+              <w:rPr>
+                <w:sz w:val="18"/>
+              </w:rPr>
+              <w:t>Light-load, high-speed, marginal-lube bearings</w:t>
+            </w:r>
+          </w:p>
+        </w:tc>
+      </w:tr>
+      <w:tr>
+        <w:tc>
+          <w:tcPr>
+            <w:tcW w:type="dxa" w:w="1930"/>
+          </w:tcPr>
+          <w:p>
+            <w:r/>
+            <w:r>
+              <w:rPr>
+                <w:sz w:val="18"/>
+              </w:rPr>
+              <w:t>Tin bronze (gear bronze)</w:t>
+            </w:r>
+          </w:p>
+        </w:tc>
+        <w:tc>
+          <w:tcPr>
+            <w:tcW w:type="dxa" w:w="1930"/>
+          </w:tcPr>
+          <w:p>
+            <w:r/>
+            <w:r>
+              <w:rPr>
+                <w:sz w:val="18"/>
+              </w:rPr>
+              <w:t>C90700</w:t>
+            </w:r>
+          </w:p>
+        </w:tc>
+        <w:tc>
+          <w:tcPr>
+            <w:tcW w:type="dxa" w:w="1930"/>
+          </w:tcPr>
+          <w:p>
+            <w:r/>
+            <w:r>
+              <w:rPr>
+                <w:sz w:val="18"/>
+              </w:rPr>
+              <w:t>Cu 89, Sn 11</w:t>
+            </w:r>
+          </w:p>
+        </w:tc>
+        <w:tc>
+          <w:tcPr>
+            <w:tcW w:type="dxa" w:w="1930"/>
+          </w:tcPr>
+          <w:p>
+            <w:r/>
+            <w:r>
+              <w:rPr>
+                <w:sz w:val="18"/>
+              </w:rPr>
+              <w:t>Tensile about 310 MPa; 80 HB; fatigue resistant</w:t>
+            </w:r>
+          </w:p>
+        </w:tc>
+        <w:tc>
+          <w:tcPr>
+            <w:tcW w:type="dxa" w:w="1930"/>
+          </w:tcPr>
+          <w:p>
+            <w:r/>
+            <w:r>
+              <w:rPr>
+                <w:sz w:val="18"/>
+              </w:rPr>
+              <w:t>Heavy-load, slow-speed bushes, worm wheels</w:t>
+            </w:r>
+          </w:p>
+        </w:tc>
+      </w:tr>
+      <w:tr>
+        <w:tc>
+          <w:tcPr>
+            <w:tcW w:type="dxa" w:w="1930"/>
+            <w:shd w:val="clear" w:color="auto" w:fill="F3EEDC"/>
+          </w:tcPr>
+          <w:p>
+            <w:r/>
+            <w:r>
+              <w:rPr>
+                <w:sz w:val="18"/>
+              </w:rPr>
+              <w:t>Phosphor bronze (casting)</w:t>
+            </w:r>
+          </w:p>
+        </w:tc>
+        <w:tc>
+          <w:tcPr>
+            <w:tcW w:type="dxa" w:w="1930"/>
+            <w:shd w:val="clear" w:color="auto" w:fill="F3EEDC"/>
+          </w:tcPr>
+          <w:p>
+            <w:r/>
+            <w:r>
+              <w:rPr>
+                <w:sz w:val="18"/>
+              </w:rPr>
+              <w:t>C90300 / IS 28 PB2</w:t>
+            </w:r>
+          </w:p>
+        </w:tc>
+        <w:tc>
+          <w:tcPr>
+            <w:tcW w:type="dxa" w:w="1930"/>
+            <w:shd w:val="clear" w:color="auto" w:fill="F3EEDC"/>
+          </w:tcPr>
+          <w:p>
+            <w:r/>
+            <w:r>
+              <w:rPr>
+                <w:sz w:val="18"/>
+              </w:rPr>
+              <w:t>Cu 88, Sn 8, Zn 4 (P about 0.2)</w:t>
+            </w:r>
+          </w:p>
+        </w:tc>
+        <w:tc>
+          <w:tcPr>
+            <w:tcW w:type="dxa" w:w="1930"/>
+            <w:shd w:val="clear" w:color="auto" w:fill="F3EEDC"/>
+          </w:tcPr>
+          <w:p>
+            <w:r/>
+            <w:r>
+              <w:rPr>
+                <w:sz w:val="18"/>
+              </w:rPr>
+              <w:t>Hard and tough</w:t>
+            </w:r>
+          </w:p>
+        </w:tc>
+        <w:tc>
+          <w:tcPr>
+            <w:tcW w:type="dxa" w:w="1930"/>
+            <w:shd w:val="clear" w:color="auto" w:fill="F3EEDC"/>
+          </w:tcPr>
+          <w:p>
+            <w:r/>
+            <w:r>
+              <w:rPr>
+                <w:sz w:val="18"/>
+              </w:rPr>
+              <w:t>Gears, bushes for shock load</w:t>
+            </w:r>
+          </w:p>
+        </w:tc>
+      </w:tr>
+      <w:tr>
+        <w:tc>
+          <w:tcPr>
+            <w:tcW w:type="dxa" w:w="1930"/>
+          </w:tcPr>
+          <w:p>
+            <w:r/>
+            <w:r>
+              <w:rPr>
+                <w:sz w:val="18"/>
+              </w:rPr>
+              <w:t>Phosphor bronze (strip / rolled)</w:t>
+            </w:r>
+          </w:p>
+        </w:tc>
+        <w:tc>
+          <w:tcPr>
+            <w:tcW w:type="dxa" w:w="1930"/>
+          </w:tcPr>
+          <w:p>
+            <w:r/>
+            <w:r>
+              <w:rPr>
+                <w:sz w:val="18"/>
+              </w:rPr>
+              <w:t>C51000 / C52100</w:t>
+            </w:r>
+          </w:p>
+        </w:tc>
+        <w:tc>
+          <w:tcPr>
+            <w:tcW w:type="dxa" w:w="1930"/>
+          </w:tcPr>
+          <w:p>
+            <w:r/>
+            <w:r>
+              <w:rPr>
+                <w:sz w:val="18"/>
+              </w:rPr>
+              <w:t>Cu 92, Sn 8, P 0.2</w:t>
+            </w:r>
+          </w:p>
+        </w:tc>
+        <w:tc>
+          <w:tcPr>
+            <w:tcW w:type="dxa" w:w="1930"/>
+          </w:tcPr>
+          <w:p>
+            <w:r/>
+            <w:r>
+              <w:rPr>
+                <w:sz w:val="18"/>
+              </w:rPr>
+              <w:t>Springy, fatigue resistant</w:t>
+            </w:r>
+          </w:p>
+        </w:tc>
+        <w:tc>
+          <w:tcPr>
+            <w:tcW w:type="dxa" w:w="1930"/>
+          </w:tcPr>
+          <w:p>
+            <w:r/>
+            <w:r>
+              <w:rPr>
+                <w:sz w:val="18"/>
+              </w:rPr>
+              <w:t>Rolled, split and clench bushes, thrust washers</w:t>
+            </w:r>
+          </w:p>
+        </w:tc>
+      </w:tr>
+      <w:tr>
+        <w:tc>
+          <w:tcPr>
+            <w:tcW w:type="dxa" w:w="1930"/>
+            <w:shd w:val="clear" w:color="auto" w:fill="F3EEDC"/>
+          </w:tcPr>
+          <w:p>
+            <w:r/>
+            <w:r>
+              <w:rPr>
+                <w:sz w:val="18"/>
+              </w:rPr>
+              <w:t>Free-cutting phosphor bronze</w:t>
+            </w:r>
+          </w:p>
+        </w:tc>
+        <w:tc>
+          <w:tcPr>
+            <w:tcW w:type="dxa" w:w="1930"/>
+            <w:shd w:val="clear" w:color="auto" w:fill="F3EEDC"/>
+          </w:tcPr>
+          <w:p>
+            <w:r/>
+            <w:r>
+              <w:rPr>
+                <w:sz w:val="18"/>
+              </w:rPr>
+              <w:t>C54400</w:t>
+            </w:r>
+          </w:p>
+        </w:tc>
+        <w:tc>
+          <w:tcPr>
+            <w:tcW w:type="dxa" w:w="1930"/>
+            <w:shd w:val="clear" w:color="auto" w:fill="F3EEDC"/>
+          </w:tcPr>
+          <w:p>
+            <w:r/>
+            <w:r>
+              <w:rPr>
+                <w:sz w:val="18"/>
+              </w:rPr>
+              <w:t>Cu 88, Sn 4, Pb 4, Zn 4</w:t>
+            </w:r>
+          </w:p>
+        </w:tc>
+        <w:tc>
+          <w:tcPr>
+            <w:tcW w:type="dxa" w:w="1930"/>
+            <w:shd w:val="clear" w:color="auto" w:fill="F3EEDC"/>
+          </w:tcPr>
+          <w:p>
+            <w:r/>
+            <w:r>
+              <w:rPr>
+                <w:sz w:val="18"/>
+              </w:rPr>
+              <w:t>Good machinability</w:t>
+            </w:r>
+          </w:p>
+        </w:tc>
+        <w:tc>
+          <w:tcPr>
+            <w:tcW w:type="dxa" w:w="1930"/>
+            <w:shd w:val="clear" w:color="auto" w:fill="F3EEDC"/>
+          </w:tcPr>
+          <w:p>
+            <w:r/>
+            <w:r>
+              <w:rPr>
+                <w:sz w:val="18"/>
+              </w:rPr>
+              <w:t>Small turned bushes and washers</w:t>
+            </w:r>
+          </w:p>
+        </w:tc>
+      </w:tr>
+      <w:tr>
+        <w:tc>
+          <w:tcPr>
+            <w:tcW w:type="dxa" w:w="1930"/>
+          </w:tcPr>
+          <w:p>
+            <w:r/>
+            <w:r>
+              <w:rPr>
+                <w:sz w:val="18"/>
+              </w:rPr>
+              <w:t>Aluminium bronze</w:t>
+            </w:r>
+          </w:p>
+        </w:tc>
+        <w:tc>
+          <w:tcPr>
+            <w:tcW w:type="dxa" w:w="1930"/>
+          </w:tcPr>
+          <w:p>
+            <w:r/>
+            <w:r>
+              <w:rPr>
+                <w:sz w:val="18"/>
+              </w:rPr>
+              <w:t>C95400</w:t>
+            </w:r>
+          </w:p>
+        </w:tc>
+        <w:tc>
+          <w:tcPr>
+            <w:tcW w:type="dxa" w:w="1930"/>
+          </w:tcPr>
+          <w:p>
+            <w:r/>
+            <w:r>
+              <w:rPr>
+                <w:sz w:val="18"/>
+              </w:rPr>
+              <w:t>Cu 85, Al 11, Fe 4</w:t>
+            </w:r>
+          </w:p>
+        </w:tc>
+        <w:tc>
+          <w:tcPr>
+            <w:tcW w:type="dxa" w:w="1930"/>
+          </w:tcPr>
+          <w:p>
+            <w:r/>
+            <w:r>
+              <w:rPr>
+                <w:sz w:val="18"/>
+              </w:rPr>
+              <w:t>Tensile about 550 MPa; 110 to 150 HB</w:t>
+            </w:r>
+          </w:p>
+        </w:tc>
+        <w:tc>
+          <w:tcPr>
+            <w:tcW w:type="dxa" w:w="1930"/>
+          </w:tcPr>
+          <w:p>
+            <w:r/>
+            <w:r>
+              <w:rPr>
+                <w:sz w:val="18"/>
+              </w:rPr>
+              <w:t>Heavy load, high temperature, wear and corrosion</w:t>
+            </w:r>
+          </w:p>
+        </w:tc>
+      </w:tr>
+      <w:tr>
+        <w:tc>
+          <w:tcPr>
+            <w:tcW w:type="dxa" w:w="1930"/>
+            <w:shd w:val="clear" w:color="auto" w:fill="F3EEDC"/>
+          </w:tcPr>
+          <w:p>
+            <w:r/>
+            <w:r>
+              <w:rPr>
+                <w:sz w:val="18"/>
+              </w:rPr>
+              <w:t>Manganese bronze (high-tensile brass)</w:t>
+            </w:r>
+          </w:p>
+        </w:tc>
+        <w:tc>
+          <w:tcPr>
+            <w:tcW w:type="dxa" w:w="1930"/>
+            <w:shd w:val="clear" w:color="auto" w:fill="F3EEDC"/>
+          </w:tcPr>
+          <w:p>
+            <w:r/>
+            <w:r>
+              <w:rPr>
+                <w:sz w:val="18"/>
+              </w:rPr>
+              <w:t>C86300</w:t>
+            </w:r>
+          </w:p>
+        </w:tc>
+        <w:tc>
+          <w:tcPr>
+            <w:tcW w:type="dxa" w:w="1930"/>
+            <w:shd w:val="clear" w:color="auto" w:fill="F3EEDC"/>
+          </w:tcPr>
+          <w:p>
+            <w:r/>
+            <w:r>
+              <w:rPr>
+                <w:sz w:val="18"/>
+              </w:rPr>
+              <w:t>Cu 63, Zn 25, Al 6, Mn 3, Fe 3</w:t>
+            </w:r>
+          </w:p>
+        </w:tc>
+        <w:tc>
+          <w:tcPr>
+            <w:tcW w:type="dxa" w:w="1930"/>
+            <w:shd w:val="clear" w:color="auto" w:fill="F3EEDC"/>
+          </w:tcPr>
+          <w:p>
+            <w:r/>
+            <w:r>
+              <w:rPr>
+                <w:sz w:val="18"/>
+              </w:rPr>
+              <w:t>Tensile about 760 MPa; very high strength</w:t>
+            </w:r>
+          </w:p>
+        </w:tc>
+        <w:tc>
+          <w:tcPr>
+            <w:tcW w:type="dxa" w:w="1930"/>
+            <w:shd w:val="clear" w:color="auto" w:fill="F3EEDC"/>
+          </w:tcPr>
+          <w:p>
+            <w:r/>
+            <w:r>
+              <w:rPr>
+                <w:sz w:val="18"/>
+              </w:rPr>
+              <w:t>Very heavy load, low speed: presses, rolling mills, crane bushes</w:t>
+            </w:r>
+          </w:p>
+        </w:tc>
+      </w:tr>
+      <w:tr>
+        <w:tc>
+          <w:tcPr>
+            <w:tcW w:type="dxa" w:w="1930"/>
+          </w:tcPr>
+          <w:p>
+            <w:r/>
+            <w:r>
+              <w:rPr>
+                <w:sz w:val="18"/>
+              </w:rPr>
+              <w:t>Brass</w:t>
+            </w:r>
+          </w:p>
+        </w:tc>
+        <w:tc>
+          <w:tcPr>
+            <w:tcW w:type="dxa" w:w="1930"/>
+          </w:tcPr>
+          <w:p>
+            <w:r/>
+            <w:r>
+              <w:rPr>
+                <w:sz w:val="18"/>
+              </w:rPr>
+              <w:t>C36000 / C37700</w:t>
+            </w:r>
+          </w:p>
+        </w:tc>
+        <w:tc>
+          <w:tcPr>
+            <w:tcW w:type="dxa" w:w="1930"/>
+          </w:tcPr>
+          <w:p>
+            <w:r/>
+            <w:r>
+              <w:rPr>
+                <w:sz w:val="18"/>
+              </w:rPr>
+              <w:t>Cu 60, Zn 38, Pb 2</w:t>
+            </w:r>
+          </w:p>
+        </w:tc>
+        <w:tc>
+          <w:tcPr>
+            <w:tcW w:type="dxa" w:w="1930"/>
+          </w:tcPr>
+          <w:p>
+            <w:r/>
+            <w:r>
+              <w:rPr>
+                <w:sz w:val="18"/>
+              </w:rPr>
+              <w:t>Economical, medium load</w:t>
+            </w:r>
+          </w:p>
+        </w:tc>
+        <w:tc>
+          <w:tcPr>
+            <w:tcW w:type="dxa" w:w="1930"/>
+          </w:tcPr>
+          <w:p>
+            <w:r/>
+            <w:r>
+              <w:rPr>
+                <w:sz w:val="18"/>
+              </w:rPr>
+              <w:t>Light-duty and decorative bushes, hinges</w:t>
+            </w:r>
+          </w:p>
+        </w:tc>
+      </w:tr>
+      <w:tr>
+        <w:tc>
+          <w:tcPr>
+            <w:tcW w:type="dxa" w:w="1930"/>
+            <w:shd w:val="clear" w:color="auto" w:fill="F3EEDC"/>
+          </w:tcPr>
+          <w:p>
+            <w:r/>
+            <w:r>
+              <w:rPr>
+                <w:sz w:val="18"/>
+              </w:rPr>
+              <w:t>Beryllium copper</w:t>
+            </w:r>
+          </w:p>
+        </w:tc>
+        <w:tc>
+          <w:tcPr>
+            <w:tcW w:type="dxa" w:w="1930"/>
+            <w:shd w:val="clear" w:color="auto" w:fill="F3EEDC"/>
+          </w:tcPr>
+          <w:p>
+            <w:r/>
+            <w:r>
+              <w:rPr>
+                <w:sz w:val="18"/>
+              </w:rPr>
+              <w:t>C17200</w:t>
+            </w:r>
+          </w:p>
+        </w:tc>
+        <w:tc>
+          <w:tcPr>
+            <w:tcW w:type="dxa" w:w="1930"/>
+            <w:shd w:val="clear" w:color="auto" w:fill="F3EEDC"/>
+          </w:tcPr>
+          <w:p>
+            <w:r/>
+            <w:r>
+              <w:rPr>
+                <w:sz w:val="18"/>
+              </w:rPr>
+              <w:t>Cu 98, Be 2</w:t>
+            </w:r>
+          </w:p>
+        </w:tc>
+        <w:tc>
+          <w:tcPr>
+            <w:tcW w:type="dxa" w:w="1930"/>
+            <w:shd w:val="clear" w:color="auto" w:fill="F3EEDC"/>
+          </w:tcPr>
+          <w:p>
+            <w:r/>
+            <w:r>
+              <w:rPr>
+                <w:sz w:val="18"/>
+              </w:rPr>
+              <w:t>Very high strength and non-sparking</w:t>
+            </w:r>
+          </w:p>
+        </w:tc>
+        <w:tc>
+          <w:tcPr>
+            <w:tcW w:type="dxa" w:w="1930"/>
+            <w:shd w:val="clear" w:color="auto" w:fill="F3EEDC"/>
+          </w:tcPr>
+          <w:p>
+            <w:r/>
+            <w:r>
+              <w:rPr>
+                <w:sz w:val="18"/>
+              </w:rPr>
+              <w:t>Aerospace, mining, oil and gas safety tools and bushes</w:t>
+            </w:r>
+          </w:p>
+        </w:tc>
+      </w:tr>
+      <w:tr>
+        <w:tc>
+          <w:tcPr>
+            <w:tcW w:type="dxa" w:w="1930"/>
+          </w:tcPr>
+          <w:p>
+            <w:r/>
+            <w:r>
+              <w:rPr>
+                <w:sz w:val="18"/>
+              </w:rPr>
+              <w:t>Graphite-plugged bronze</w:t>
+            </w:r>
+          </w:p>
+        </w:tc>
+        <w:tc>
+          <w:tcPr>
+            <w:tcW w:type="dxa" w:w="1930"/>
+          </w:tcPr>
+          <w:p>
+            <w:r/>
+            <w:r>
+              <w:rPr>
+                <w:sz w:val="18"/>
+              </w:rPr>
+              <w:t>C86300 / C93200 base + graphite</w:t>
+            </w:r>
+          </w:p>
+        </w:tc>
+        <w:tc>
+          <w:tcPr>
+            <w:tcW w:type="dxa" w:w="1930"/>
+          </w:tcPr>
+          <w:p>
+            <w:r/>
+            <w:r>
+              <w:rPr>
+                <w:sz w:val="18"/>
+              </w:rPr>
+              <w:t>Bronze with 20 to 30 percent graphite plugs</w:t>
+            </w:r>
+          </w:p>
+        </w:tc>
+        <w:tc>
+          <w:tcPr>
+            <w:tcW w:type="dxa" w:w="1930"/>
+          </w:tcPr>
+          <w:p>
+            <w:r/>
+            <w:r>
+              <w:rPr>
+                <w:sz w:val="18"/>
+              </w:rPr>
+              <w:t>Self-lubricating, runs dry</w:t>
+            </w:r>
+          </w:p>
+        </w:tc>
+        <w:tc>
+          <w:tcPr>
+            <w:tcW w:type="dxa" w:w="1930"/>
+          </w:tcPr>
+          <w:p>
+            <w:r/>
+            <w:r>
+              <w:rPr>
+                <w:sz w:val="18"/>
+              </w:rPr>
+              <w:t>Steel plants, furnace, high-temperature and slow heavy bushes</w:t>
+            </w:r>
+          </w:p>
+        </w:tc>
+      </w:tr>
+    </w:tbl>
+    <w:p/>
+    <w:p>
+      <w:pPr>
+        <w:pStyle w:val="Heading2"/>
+      </w:pPr>
+      <w:r>
+        <w:rPr>
+          <w:color w:val="B8860B"/>
+        </w:rPr>
+        <w:t>4.2 Other bearing materials (for comparison)</w:t>
+      </w:r>
+    </w:p>
+    <w:p>
+      <w:r>
+        <w:rPr>
+          <w:b/>
+          <w:sz w:val="18"/>
+        </w:rPr>
+        <w:t>Table 5: Non-bronze bearing materials</w:t>
+      </w:r>
+    </w:p>
+    <w:tbl>
+      <w:tblPr>
+        <w:tblStyle w:val="TableGrid"/>
+        <w:tblW w:type="auto" w:w="0"/>
+        <w:jc w:val="center"/>
+        <w:tblLook w:firstColumn="1" w:firstRow="1" w:lastColumn="0" w:lastRow="0" w:noHBand="0" w:noVBand="1" w:val="04A0"/>
+      </w:tblPr>
+      <w:tblGrid>
+        <w:gridCol w:w="3216"/>
+        <w:gridCol w:w="3216"/>
+        <w:gridCol w:w="3216"/>
+      </w:tblGrid>
+      <w:tr>
+        <w:tc>
+          <w:tcPr>
+            <w:tcW w:type="dxa" w:w="3216"/>
+            <w:shd w:val="clear" w:color="auto" w:fill="1F2A44"/>
+          </w:tcPr>
+          <w:p>
+            <w:r/>
+            <w:r>
+              <w:rPr>
+                <w:b/>
+                <w:color w:val="FFFFFF"/>
+                <w:sz w:val="18"/>
+              </w:rPr>
+              <w:t>Material</w:t>
+            </w:r>
+          </w:p>
+        </w:tc>
+        <w:tc>
+          <w:tcPr>
+            <w:tcW w:type="dxa" w:w="3216"/>
+            <w:shd w:val="clear" w:color="auto" w:fill="1F2A44"/>
+          </w:tcPr>
+          <w:p>
+            <w:r/>
+            <w:r>
+              <w:rPr>
+                <w:b/>
+                <w:color w:val="FFFFFF"/>
+                <w:sz w:val="18"/>
+              </w:rPr>
+              <w:t>Where used</w:t>
+            </w:r>
+          </w:p>
+        </w:tc>
+        <w:tc>
+          <w:tcPr>
+            <w:tcW w:type="dxa" w:w="3216"/>
+            <w:shd w:val="clear" w:color="auto" w:fill="1F2A44"/>
+          </w:tcPr>
+          <w:p>
+            <w:r/>
+            <w:r>
+              <w:rPr>
+                <w:b/>
+                <w:color w:val="FFFFFF"/>
+                <w:sz w:val="18"/>
+              </w:rPr>
+              <w:t>Why / limitation</w:t>
+            </w:r>
+          </w:p>
+        </w:tc>
+      </w:tr>
+      <w:tr>
+        <w:tc>
+          <w:tcPr>
+            <w:tcW w:type="dxa" w:w="3216"/>
+          </w:tcPr>
+          <w:p>
+            <w:r/>
+            <w:r>
+              <w:rPr>
+                <w:sz w:val="18"/>
+              </w:rPr>
+              <w:t>Tin and lead babbitt (white metal)</w:t>
+            </w:r>
+          </w:p>
+        </w:tc>
+        <w:tc>
+          <w:tcPr>
+            <w:tcW w:type="dxa" w:w="3216"/>
+          </w:tcPr>
+          <w:p>
+            <w:r/>
+            <w:r>
+              <w:rPr>
+                <w:sz w:val="18"/>
+              </w:rPr>
+              <w:t>Large engines, turbines, heavy gearboxes</w:t>
+            </w:r>
+          </w:p>
+        </w:tc>
+        <w:tc>
+          <w:tcPr>
+            <w:tcW w:type="dxa" w:w="3216"/>
+          </w:tcPr>
+          <w:p>
+            <w:r/>
+            <w:r>
+              <w:rPr>
+                <w:sz w:val="18"/>
+              </w:rPr>
+              <w:t>Excellent embedability; low strength, needs steel backing</w:t>
+            </w:r>
+          </w:p>
+        </w:tc>
+      </w:tr>
+      <w:tr>
+        <w:tc>
+          <w:tcPr>
+            <w:tcW w:type="dxa" w:w="3216"/>
+            <w:shd w:val="clear" w:color="auto" w:fill="F3EEDC"/>
+          </w:tcPr>
+          <w:p>
+            <w:r/>
+            <w:r>
+              <w:rPr>
+                <w:sz w:val="18"/>
+              </w:rPr>
+              <w:t>Aluminium-tin / aluminium-silicon</w:t>
+            </w:r>
+          </w:p>
+        </w:tc>
+        <w:tc>
+          <w:tcPr>
+            <w:tcW w:type="dxa" w:w="3216"/>
+            <w:shd w:val="clear" w:color="auto" w:fill="F3EEDC"/>
+          </w:tcPr>
+          <w:p>
+            <w:r/>
+            <w:r>
+              <w:rPr>
+                <w:sz w:val="18"/>
+              </w:rPr>
+              <w:t>Automotive engine bearings</w:t>
+            </w:r>
+          </w:p>
+        </w:tc>
+        <w:tc>
+          <w:tcPr>
+            <w:tcW w:type="dxa" w:w="3216"/>
+            <w:shd w:val="clear" w:color="auto" w:fill="F3EEDC"/>
+          </w:tcPr>
+          <w:p>
+            <w:r/>
+            <w:r>
+              <w:rPr>
+                <w:sz w:val="18"/>
+              </w:rPr>
+              <w:t>Fatigue strength, lower cost than bronze</w:t>
+            </w:r>
+          </w:p>
+        </w:tc>
+      </w:tr>
+      <w:tr>
+        <w:tc>
+          <w:tcPr>
+            <w:tcW w:type="dxa" w:w="3216"/>
+          </w:tcPr>
+          <w:p>
+            <w:r/>
+            <w:r>
+              <w:rPr>
+                <w:sz w:val="18"/>
+              </w:rPr>
+              <w:t>Steel-backed bimetal (bronze or Al-Sn lining)</w:t>
+            </w:r>
+          </w:p>
+        </w:tc>
+        <w:tc>
+          <w:tcPr>
+            <w:tcW w:type="dxa" w:w="3216"/>
+          </w:tcPr>
+          <w:p>
+            <w:r/>
+            <w:r>
+              <w:rPr>
+                <w:sz w:val="18"/>
+              </w:rPr>
+              <w:t>Engines, hydraulics, construction machinery</w:t>
+            </w:r>
+          </w:p>
+        </w:tc>
+        <w:tc>
+          <w:tcPr>
+            <w:tcW w:type="dxa" w:w="3216"/>
+          </w:tcPr>
+          <w:p>
+            <w:r/>
+            <w:r>
+              <w:rPr>
+                <w:sz w:val="18"/>
+              </w:rPr>
+              <w:t>Strong back, thin bearing layer</w:t>
+            </w:r>
+          </w:p>
+        </w:tc>
+      </w:tr>
+      <w:tr>
+        <w:tc>
+          <w:tcPr>
+            <w:tcW w:type="dxa" w:w="3216"/>
+            <w:shd w:val="clear" w:color="auto" w:fill="F3EEDC"/>
+          </w:tcPr>
+          <w:p>
+            <w:r/>
+            <w:r>
+              <w:rPr>
+                <w:sz w:val="18"/>
+              </w:rPr>
+              <w:t>Sintered bronze (Cu 90, Sn 10) with oil</w:t>
+            </w:r>
+          </w:p>
+        </w:tc>
+        <w:tc>
+          <w:tcPr>
+            <w:tcW w:type="dxa" w:w="3216"/>
+            <w:shd w:val="clear" w:color="auto" w:fill="F3EEDC"/>
+          </w:tcPr>
+          <w:p>
+            <w:r/>
+            <w:r>
+              <w:rPr>
+                <w:sz w:val="18"/>
+              </w:rPr>
+              <w:t>Fans, appliances, small motors</w:t>
+            </w:r>
+          </w:p>
+        </w:tc>
+        <w:tc>
+          <w:tcPr>
+            <w:tcW w:type="dxa" w:w="3216"/>
+            <w:shd w:val="clear" w:color="auto" w:fill="F3EEDC"/>
+          </w:tcPr>
+          <w:p>
+            <w:r/>
+            <w:r>
+              <w:rPr>
+                <w:sz w:val="18"/>
+              </w:rPr>
+              <w:t>Maintenance-free; low load</w:t>
+            </w:r>
+          </w:p>
+        </w:tc>
+      </w:tr>
+      <w:tr>
+        <w:tc>
+          <w:tcPr>
+            <w:tcW w:type="dxa" w:w="3216"/>
+          </w:tcPr>
+          <w:p>
+            <w:r/>
+            <w:r>
+              <w:rPr>
+                <w:sz w:val="18"/>
+              </w:rPr>
+              <w:t>Sintered iron / iron-copper</w:t>
+            </w:r>
+          </w:p>
+        </w:tc>
+        <w:tc>
+          <w:tcPr>
+            <w:tcW w:type="dxa" w:w="3216"/>
+          </w:tcPr>
+          <w:p>
+            <w:r/>
+            <w:r>
+              <w:rPr>
+                <w:sz w:val="18"/>
+              </w:rPr>
+              <w:t>Low-cost light-duty bushes</w:t>
+            </w:r>
+          </w:p>
+        </w:tc>
+        <w:tc>
+          <w:tcPr>
+            <w:tcW w:type="dxa" w:w="3216"/>
+          </w:tcPr>
+          <w:p>
+            <w:r/>
+            <w:r>
+              <w:rPr>
+                <w:sz w:val="18"/>
+              </w:rPr>
+              <w:t>Cheaper but lower wear resistance</w:t>
+            </w:r>
+          </w:p>
+        </w:tc>
+      </w:tr>
+      <w:tr>
+        <w:tc>
+          <w:tcPr>
+            <w:tcW w:type="dxa" w:w="3216"/>
+            <w:shd w:val="clear" w:color="auto" w:fill="F3EEDC"/>
+          </w:tcPr>
+          <w:p>
+            <w:r/>
+            <w:r>
+              <w:rPr>
+                <w:sz w:val="18"/>
+              </w:rPr>
+              <w:t>Cast iron (grey, SG)</w:t>
+            </w:r>
+          </w:p>
+        </w:tc>
+        <w:tc>
+          <w:tcPr>
+            <w:tcW w:type="dxa" w:w="3216"/>
+            <w:shd w:val="clear" w:color="auto" w:fill="F3EEDC"/>
+          </w:tcPr>
+          <w:p>
+            <w:r/>
+            <w:r>
+              <w:rPr>
+                <w:sz w:val="18"/>
+              </w:rPr>
+              <w:t>Slow, low-cost applications</w:t>
+            </w:r>
+          </w:p>
+        </w:tc>
+        <w:tc>
+          <w:tcPr>
+            <w:tcW w:type="dxa" w:w="3216"/>
+            <w:shd w:val="clear" w:color="auto" w:fill="F3EEDC"/>
+          </w:tcPr>
+          <w:p>
+            <w:r/>
+            <w:r>
+              <w:rPr>
+                <w:sz w:val="18"/>
+              </w:rPr>
+              <w:t>Self-lubricating graphite flakes</w:t>
+            </w:r>
+          </w:p>
+        </w:tc>
+      </w:tr>
+      <w:tr>
+        <w:tc>
+          <w:tcPr>
+            <w:tcW w:type="dxa" w:w="3216"/>
+          </w:tcPr>
+          <w:p>
+            <w:r/>
+            <w:r>
+              <w:rPr>
+                <w:sz w:val="18"/>
+              </w:rPr>
+              <w:t>Polymers (PTFE, nylon, PEEK, POM) and composites</w:t>
+            </w:r>
+          </w:p>
+        </w:tc>
+        <w:tc>
+          <w:tcPr>
+            <w:tcW w:type="dxa" w:w="3216"/>
+          </w:tcPr>
+          <w:p>
+            <w:r/>
+            <w:r>
+              <w:rPr>
+                <w:sz w:val="18"/>
+              </w:rPr>
+              <w:t>Dry-running, corrosion, food and pharma use</w:t>
+            </w:r>
+          </w:p>
+        </w:tc>
+        <w:tc>
+          <w:tcPr>
+            <w:tcW w:type="dxa" w:w="3216"/>
+          </w:tcPr>
+          <w:p>
+            <w:r/>
+            <w:r>
+              <w:rPr>
+                <w:sz w:val="18"/>
+              </w:rPr>
+              <w:t>No lubrication needed; limited temperature and load</w:t>
+            </w:r>
+          </w:p>
+        </w:tc>
+      </w:tr>
+      <w:tr>
+        <w:tc>
+          <w:tcPr>
+            <w:tcW w:type="dxa" w:w="3216"/>
+            <w:shd w:val="clear" w:color="auto" w:fill="F3EEDC"/>
+          </w:tcPr>
+          <w:p>
+            <w:r/>
+            <w:r>
+              <w:rPr>
+                <w:sz w:val="18"/>
+              </w:rPr>
+              <w:t>Rubber and polyurethane</w:t>
+            </w:r>
+          </w:p>
+        </w:tc>
+        <w:tc>
+          <w:tcPr>
+            <w:tcW w:type="dxa" w:w="3216"/>
+            <w:shd w:val="clear" w:color="auto" w:fill="F3EEDC"/>
+          </w:tcPr>
+          <w:p>
+            <w:r/>
+            <w:r>
+              <w:rPr>
+                <w:sz w:val="18"/>
+              </w:rPr>
+              <w:t>Vehicle suspension, vibration isolation</w:t>
+            </w:r>
+          </w:p>
+        </w:tc>
+        <w:tc>
+          <w:tcPr>
+            <w:tcW w:type="dxa" w:w="3216"/>
+            <w:shd w:val="clear" w:color="auto" w:fill="F3EEDC"/>
+          </w:tcPr>
+          <w:p>
+            <w:r/>
+            <w:r>
+              <w:rPr>
+                <w:sz w:val="18"/>
+              </w:rPr>
+              <w:t>Absorbs shock; not for high speed</w:t>
+            </w:r>
+          </w:p>
+        </w:tc>
+      </w:tr>
+    </w:tbl>
+    <w:p/>
+    <w:p>
+      <w:pPr>
+        <w:pStyle w:val="Heading2"/>
+      </w:pPr>
+      <w:r>
+        <w:rPr>
+          <w:color w:val="B8860B"/>
+        </w:rPr>
+        <w:t>4.3 Alloy selection by application</w:t>
+      </w:r>
+    </w:p>
+    <w:p>
+      <w:r>
+        <w:rPr>
+          <w:b/>
+          <w:sz w:val="18"/>
+        </w:rPr>
+        <w:t>Table 6: Alloy recommendations by bush application</w:t>
       </w:r>
     </w:p>
     <w:tbl>
@@ -1690,7 +3249,7 @@
                 <w:color w:val="FFFFFF"/>
                 <w:sz w:val="18"/>
               </w:rPr>
-              <w:t>Alloy</w:t>
+              <w:t>Application</w:t>
             </w:r>
           </w:p>
         </w:tc>
@@ -1707,7 +3266,7 @@
                 <w:color w:val="FFFFFF"/>
                 <w:sz w:val="18"/>
               </w:rPr>
-              <w:t>Typical composition</w:t>
+              <w:t>Load / speed</w:t>
             </w:r>
           </w:p>
         </w:tc>
@@ -1724,7 +3283,7 @@
                 <w:color w:val="FFFFFF"/>
                 <w:sz w:val="18"/>
               </w:rPr>
-              <w:t>Properties</w:t>
+              <w:t>Preferred alloy</w:t>
             </w:r>
           </w:p>
         </w:tc>
@@ -1741,7 +3300,7 @@
                 <w:color w:val="FFFFFF"/>
                 <w:sz w:val="18"/>
               </w:rPr>
-              <w:t>Typical use</w:t>
+              <w:t>Alternative</w:t>
             </w:r>
           </w:p>
         </w:tc>
@@ -1757,7 +3316,7 @@
               <w:rPr>
                 <w:sz w:val="18"/>
               </w:rPr>
-              <w:t>Leaded gunmetal (LG2 / LTB2)</w:t>
+              <w:t>Electric motor, fan, pump</w:t>
             </w:r>
           </w:p>
         </w:tc>
@@ -1771,7 +3330,7 @@
               <w:rPr>
                 <w:sz w:val="18"/>
               </w:rPr>
-              <w:t>Cu 85, Sn 5, Pb 5, Zn 5</w:t>
+              <w:t>Light to medium, high speed</w:t>
             </w:r>
           </w:p>
         </w:tc>
@@ -1785,7 +3344,7 @@
               <w:rPr>
                 <w:sz w:val="18"/>
               </w:rPr>
-              <w:t>Good wear, pressure-tight</w:t>
+              <w:t>C93700 (80-10-10), SAE 660</w:t>
             </w:r>
           </w:p>
         </w:tc>
@@ -1799,7 +3358,7 @@
               <w:rPr>
                 <w:sz w:val="18"/>
               </w:rPr>
-              <w:t>Pump and valve bushes</w:t>
+              <w:t>Sintered bronze</w:t>
             </w:r>
           </w:p>
         </w:tc>
@@ -1816,7 +3375,7 @@
               <w:rPr>
                 <w:sz w:val="18"/>
               </w:rPr>
-              <w:t>Phosphor bronze (PB1 / PB2)</w:t>
+              <w:t>Tractor and agricultural implement</w:t>
             </w:r>
           </w:p>
         </w:tc>
@@ -1831,7 +3390,7 @@
               <w:rPr>
                 <w:sz w:val="18"/>
               </w:rPr>
-              <w:t>Cu 88 to 90, Sn 10 to 12, P 0.2</w:t>
+              <w:t>Medium, shock, dirty</w:t>
             </w:r>
           </w:p>
         </w:tc>
@@ -1846,7 +3405,7 @@
               <w:rPr>
                 <w:sz w:val="18"/>
               </w:rPr>
-              <w:t>Hard, fatigue-resistant</w:t>
+              <w:t>SAE 660 C93200, phosphor bronze C90300</w:t>
             </w:r>
           </w:p>
         </w:tc>
@@ -1861,7 +3420,7 @@
               <w:rPr>
                 <w:sz w:val="18"/>
               </w:rPr>
-              <w:t>Gears, worm wheels, heavy loads</w:t>
+              <w:t>Bimetal</w:t>
             </w:r>
           </w:p>
         </w:tc>
@@ -1877,7 +3436,7 @@
               <w:rPr>
                 <w:sz w:val="18"/>
               </w:rPr>
-              <w:t>Leaded tin bronze (LB 5)</w:t>
+              <w:t>Automobile suspension and gearbox</w:t>
             </w:r>
           </w:p>
         </w:tc>
@@ -1891,7 +3450,7 @@
               <w:rPr>
                 <w:sz w:val="18"/>
               </w:rPr>
-              <w:t>Cu 80, Sn 10, Pb 10</w:t>
+              <w:t>Medium, oscillating</w:t>
             </w:r>
           </w:p>
         </w:tc>
@@ -1905,7 +3464,7 @@
               <w:rPr>
                 <w:sz w:val="18"/>
               </w:rPr>
-              <w:t>Excellent for high speed, low friction</w:t>
+              <w:t>C93200 / C52100 rolled</w:t>
             </w:r>
           </w:p>
         </w:tc>
@@ -1919,7 +3478,7 @@
               <w:rPr>
                 <w:sz w:val="18"/>
               </w:rPr>
-              <w:t>Engine and motor bearings</w:t>
+              <w:t>Rubber, polymer composite</w:t>
             </w:r>
           </w:p>
         </w:tc>
@@ -1936,7 +3495,7 @@
               <w:rPr>
                 <w:sz w:val="18"/>
               </w:rPr>
-              <w:t>Aluminium bronze</w:t>
+              <w:t>Machine tool, press</w:t>
             </w:r>
           </w:p>
         </w:tc>
@@ -1951,7 +3510,7 @@
               <w:rPr>
                 <w:sz w:val="18"/>
               </w:rPr>
-              <w:t>Cu 80 to 88, Al 8 to 11, Fe, Ni</w:t>
+              <w:t>High load, slow</w:t>
             </w:r>
           </w:p>
         </w:tc>
@@ -1966,7 +3525,7 @@
               <w:rPr>
                 <w:sz w:val="18"/>
               </w:rPr>
-              <w:t>Very strong, corrosion resistant</w:t>
+              <w:t>C90700, C86300</w:t>
             </w:r>
           </w:p>
         </w:tc>
@@ -1981,7 +3540,7 @@
               <w:rPr>
                 <w:sz w:val="18"/>
               </w:rPr>
-              <w:t>Heavy load, marine</w:t>
+              <w:t>Aluminium bronze C95400</w:t>
             </w:r>
           </w:p>
         </w:tc>
@@ -1997,7 +3556,7 @@
               <w:rPr>
                 <w:sz w:val="18"/>
               </w:rPr>
-              <w:t>Brass (HB/SB)</w:t>
+              <w:t>Steel plant, rolling mill, crane</w:t>
             </w:r>
           </w:p>
         </w:tc>
@@ -2011,7 +3570,7 @@
               <w:rPr>
                 <w:sz w:val="18"/>
               </w:rPr>
-              <w:t>Cu 60, Zn 40</w:t>
+              <w:t>Very high load, slow, hot</w:t>
             </w:r>
           </w:p>
         </w:tc>
@@ -2025,7 +3584,7 @@
               <w:rPr>
                 <w:sz w:val="18"/>
               </w:rPr>
-              <w:t>Economical, medium load</w:t>
+              <w:t>C86300, graphite-plugged bronze</w:t>
             </w:r>
           </w:p>
         </w:tc>
@@ -2039,7 +3598,7 @@
               <w:rPr>
                 <w:sz w:val="18"/>
               </w:rPr>
-              <w:t>Light duty bushes</w:t>
+              <w:t>C95400</w:t>
             </w:r>
           </w:p>
         </w:tc>
@@ -2056,7 +3615,7 @@
               <w:rPr>
                 <w:sz w:val="18"/>
               </w:rPr>
-              <w:t>SAE 660 bearing bronze</w:t>
+              <w:t>Worm gear and screw nut</w:t>
             </w:r>
           </w:p>
         </w:tc>
@@ -2071,7 +3630,7 @@
               <w:rPr>
                 <w:sz w:val="18"/>
               </w:rPr>
-              <w:t>Cu 83, Sn 7, Pb 7, Zn 3</w:t>
+              <w:t>High load, sliding</w:t>
             </w:r>
           </w:p>
         </w:tc>
@@ -2086,7 +3645,7 @@
               <w:rPr>
                 <w:sz w:val="18"/>
               </w:rPr>
-              <w:t>Standard continuous-cast bronze</w:t>
+              <w:t>C90700, phosphor bronze</w:t>
             </w:r>
           </w:p>
         </w:tc>
@@ -2101,7 +3660,247 @@
               <w:rPr>
                 <w:sz w:val="18"/>
               </w:rPr>
-              <w:t>General industrial</w:t>
+              <w:t>Aluminium bronze</w:t>
+            </w:r>
+          </w:p>
+        </w:tc>
+      </w:tr>
+      <w:tr>
+        <w:tc>
+          <w:tcPr>
+            <w:tcW w:type="dxa" w:w="2412"/>
+          </w:tcPr>
+          <w:p>
+            <w:r/>
+            <w:r>
+              <w:rPr>
+                <w:sz w:val="18"/>
+              </w:rPr>
+              <w:t>Marine, pump in sea water</w:t>
+            </w:r>
+          </w:p>
+        </w:tc>
+        <w:tc>
+          <w:tcPr>
+            <w:tcW w:type="dxa" w:w="2412"/>
+          </w:tcPr>
+          <w:p>
+            <w:r/>
+            <w:r>
+              <w:rPr>
+                <w:sz w:val="18"/>
+              </w:rPr>
+              <w:t>Medium, corrosive</w:t>
+            </w:r>
+          </w:p>
+        </w:tc>
+        <w:tc>
+          <w:tcPr>
+            <w:tcW w:type="dxa" w:w="2412"/>
+          </w:tcPr>
+          <w:p>
+            <w:r/>
+            <w:r>
+              <w:rPr>
+                <w:sz w:val="18"/>
+              </w:rPr>
+              <w:t>C95800 NAB, C95400</w:t>
+            </w:r>
+          </w:p>
+        </w:tc>
+        <w:tc>
+          <w:tcPr>
+            <w:tcW w:type="dxa" w:w="2412"/>
+          </w:tcPr>
+          <w:p>
+            <w:r/>
+            <w:r>
+              <w:rPr>
+                <w:sz w:val="18"/>
+              </w:rPr>
+              <w:t>C90300</w:t>
+            </w:r>
+          </w:p>
+        </w:tc>
+      </w:tr>
+      <w:tr>
+        <w:tc>
+          <w:tcPr>
+            <w:tcW w:type="dxa" w:w="2412"/>
+            <w:shd w:val="clear" w:color="auto" w:fill="F3EEDC"/>
+          </w:tcPr>
+          <w:p>
+            <w:r/>
+            <w:r>
+              <w:rPr>
+                <w:sz w:val="18"/>
+              </w:rPr>
+              <w:t>Earth-moving machine pins</w:t>
+            </w:r>
+          </w:p>
+        </w:tc>
+        <w:tc>
+          <w:tcPr>
+            <w:tcW w:type="dxa" w:w="2412"/>
+            <w:shd w:val="clear" w:color="auto" w:fill="F3EEDC"/>
+          </w:tcPr>
+          <w:p>
+            <w:r/>
+            <w:r>
+              <w:rPr>
+                <w:sz w:val="18"/>
+              </w:rPr>
+              <w:t>High shock, low speed</w:t>
+            </w:r>
+          </w:p>
+        </w:tc>
+        <w:tc>
+          <w:tcPr>
+            <w:tcW w:type="dxa" w:w="2412"/>
+            <w:shd w:val="clear" w:color="auto" w:fill="F3EEDC"/>
+          </w:tcPr>
+          <w:p>
+            <w:r/>
+            <w:r>
+              <w:rPr>
+                <w:sz w:val="18"/>
+              </w:rPr>
+              <w:t>C95400, steel-backed bimetal</w:t>
+            </w:r>
+          </w:p>
+        </w:tc>
+        <w:tc>
+          <w:tcPr>
+            <w:tcW w:type="dxa" w:w="2412"/>
+            <w:shd w:val="clear" w:color="auto" w:fill="F3EEDC"/>
+          </w:tcPr>
+          <w:p>
+            <w:r/>
+            <w:r>
+              <w:rPr>
+                <w:sz w:val="18"/>
+              </w:rPr>
+              <w:t>C86300</w:t>
+            </w:r>
+          </w:p>
+        </w:tc>
+      </w:tr>
+      <w:tr>
+        <w:tc>
+          <w:tcPr>
+            <w:tcW w:type="dxa" w:w="2412"/>
+          </w:tcPr>
+          <w:p>
+            <w:r/>
+            <w:r>
+              <w:rPr>
+                <w:sz w:val="18"/>
+              </w:rPr>
+              <w:t>Railway axle box and wagon</w:t>
+            </w:r>
+          </w:p>
+        </w:tc>
+        <w:tc>
+          <w:tcPr>
+            <w:tcW w:type="dxa" w:w="2412"/>
+          </w:tcPr>
+          <w:p>
+            <w:r/>
+            <w:r>
+              <w:rPr>
+                <w:sz w:val="18"/>
+              </w:rPr>
+              <w:t>High load, shock</w:t>
+            </w:r>
+          </w:p>
+        </w:tc>
+        <w:tc>
+          <w:tcPr>
+            <w:tcW w:type="dxa" w:w="2412"/>
+          </w:tcPr>
+          <w:p>
+            <w:r/>
+            <w:r>
+              <w:rPr>
+                <w:sz w:val="18"/>
+              </w:rPr>
+              <w:t>Leaded bronze (LB 5), phosphor bronze</w:t>
+            </w:r>
+          </w:p>
+        </w:tc>
+        <w:tc>
+          <w:tcPr>
+            <w:tcW w:type="dxa" w:w="2412"/>
+          </w:tcPr>
+          <w:p>
+            <w:r/>
+            <w:r>
+              <w:rPr>
+                <w:sz w:val="18"/>
+              </w:rPr>
+              <w:t>Bimetal</w:t>
+            </w:r>
+          </w:p>
+        </w:tc>
+      </w:tr>
+      <w:tr>
+        <w:tc>
+          <w:tcPr>
+            <w:tcW w:type="dxa" w:w="2412"/>
+            <w:shd w:val="clear" w:color="auto" w:fill="F3EEDC"/>
+          </w:tcPr>
+          <w:p>
+            <w:r/>
+            <w:r>
+              <w:rPr>
+                <w:sz w:val="18"/>
+              </w:rPr>
+              <w:t>Appliance and office equipment</w:t>
+            </w:r>
+          </w:p>
+        </w:tc>
+        <w:tc>
+          <w:tcPr>
+            <w:tcW w:type="dxa" w:w="2412"/>
+            <w:shd w:val="clear" w:color="auto" w:fill="F3EEDC"/>
+          </w:tcPr>
+          <w:p>
+            <w:r/>
+            <w:r>
+              <w:rPr>
+                <w:sz w:val="18"/>
+              </w:rPr>
+              <w:t>Light, quiet</w:t>
+            </w:r>
+          </w:p>
+        </w:tc>
+        <w:tc>
+          <w:tcPr>
+            <w:tcW w:type="dxa" w:w="2412"/>
+            <w:shd w:val="clear" w:color="auto" w:fill="F3EEDC"/>
+          </w:tcPr>
+          <w:p>
+            <w:r/>
+            <w:r>
+              <w:rPr>
+                <w:sz w:val="18"/>
+              </w:rPr>
+              <w:t>Sintered bronze</w:t>
+            </w:r>
+          </w:p>
+        </w:tc>
+        <w:tc>
+          <w:tcPr>
+            <w:tcW w:type="dxa" w:w="2412"/>
+            <w:shd w:val="clear" w:color="auto" w:fill="F3EEDC"/>
+          </w:tcPr>
+          <w:p>
+            <w:r/>
+            <w:r>
+              <w:rPr>
+                <w:sz w:val="18"/>
+              </w:rPr>
+              <w:t>Polymer</w:t>
             </w:r>
           </w:p>
         </w:tc>
@@ -2115,8 +3914,205 @@
       <w:r>
         <w:drawing>
           <wp:inline xmlns:a="http://schemas.openxmlformats.org/drawingml/2006/main" xmlns:pic="http://schemas.openxmlformats.org/drawingml/2006/picture">
+            <wp:extent cx="5120640" cy="2579286"/>
+            <wp:docPr id="4" name="Picture 4"/>
+            <wp:cNvGraphicFramePr>
+              <a:graphicFrameLocks noChangeAspect="1"/>
+            </wp:cNvGraphicFramePr>
+            <a:graphic>
+              <a:graphicData uri="http://schemas.openxmlformats.org/drawingml/2006/picture">
+                <pic:pic>
+                  <pic:nvPicPr>
+                    <pic:cNvPr id="0" name="b_hard.png"/>
+                    <pic:cNvPicPr/>
+                  </pic:nvPicPr>
+                  <pic:blipFill>
+                    <a:blip r:embed="rId12"/>
+                    <a:stretch>
+                      <a:fillRect/>
+                    </a:stretch>
+                  </pic:blipFill>
+                  <pic:spPr>
+                    <a:xfrm>
+                      <a:off x="0" y="0"/>
+                      <a:ext cx="5120640" cy="2579286"/>
+                    </a:xfrm>
+                    <a:prstGeom prst="rect"/>
+                  </pic:spPr>
+                </pic:pic>
+              </a:graphicData>
+            </a:graphic>
+          </wp:inline>
+        </w:drawing>
+      </w:r>
+    </w:p>
+    <w:p>
+      <w:pPr>
+        <w:jc w:val="center"/>
+      </w:pPr>
+      <w:r>
+        <w:rPr>
+          <w:i/>
+          <w:sz w:val="18"/>
+        </w:rPr>
+        <w:t>Figure 4: Typical hardness of selected bush alloys (approximate handbook values, verify with supplier data)</w:t>
+      </w:r>
+    </w:p>
+    <w:p>
+      <w:pPr>
+        <w:jc w:val="center"/>
+      </w:pPr>
+      <w:r>
+        <w:drawing>
+          <wp:inline xmlns:a="http://schemas.openxmlformats.org/drawingml/2006/main" xmlns:pic="http://schemas.openxmlformats.org/drawingml/2006/picture">
+            <wp:extent cx="5486400" cy="3031160"/>
+            <wp:docPr id="5" name="Picture 5"/>
+            <wp:cNvGraphicFramePr>
+              <a:graphicFrameLocks noChangeAspect="1"/>
+            </wp:cNvGraphicFramePr>
+            <a:graphic>
+              <a:graphicData uri="http://schemas.openxmlformats.org/drawingml/2006/picture">
+                <pic:pic>
+                  <pic:nvPicPr>
+                    <pic:cNvPr id="0" name="b_alloyscore.png"/>
+                    <pic:cNvPicPr/>
+                  </pic:nvPicPr>
+                  <pic:blipFill>
+                    <a:blip r:embed="rId13"/>
+                    <a:stretch>
+                      <a:fillRect/>
+                    </a:stretch>
+                  </pic:blipFill>
+                  <pic:spPr>
+                    <a:xfrm>
+                      <a:off x="0" y="0"/>
+                      <a:ext cx="5486400" cy="3031160"/>
+                    </a:xfrm>
+                    <a:prstGeom prst="rect"/>
+                  </pic:spPr>
+                </pic:pic>
+              </a:graphicData>
+            </a:graphic>
+          </wp:inline>
+        </w:drawing>
+      </w:r>
+    </w:p>
+    <w:p>
+      <w:pPr>
+        <w:jc w:val="center"/>
+      </w:pPr>
+      <w:r>
+        <w:rPr>
+          <w:i/>
+          <w:sz w:val="18"/>
+        </w:rPr>
+        <w:t>Figure 5: Relative performance of five key bush alloys (intern judgement from standard references)</w:t>
+      </w:r>
+    </w:p>
+    <w:p>
+      <w:pPr>
+        <w:pStyle w:val="Heading2"/>
+      </w:pPr>
+      <w:r>
+        <w:rPr>
+          <w:color w:val="B8860B"/>
+        </w:rPr>
+        <w:t>4.4 Key selection issues</w:t>
+      </w:r>
+    </w:p>
+    <w:p>
+      <w:pPr>
+        <w:pStyle w:val="ListBullet"/>
+      </w:pPr>
+      <w:r>
+        <w:rPr>
+          <w:b/>
+        </w:rPr>
+        <w:t xml:space="preserve">Lead content: </w:t>
+      </w:r>
+      <w:r>
+        <w:t>More lead means better anti-seizure and machining but lower strength. Choose the lowest lead that still protects the shaft.</w:t>
+      </w:r>
+    </w:p>
+    <w:p>
+      <w:pPr>
+        <w:pStyle w:val="ListBullet"/>
+      </w:pPr>
+      <w:r>
+        <w:rPr>
+          <w:b/>
+        </w:rPr>
+        <w:t xml:space="preserve">Tin price: </w:t>
+      </w:r>
+      <w:r>
+        <w:t>Tin is the costly element; swapping 10 percent tin bronze for 7 percent tin or for lead bronze changes cost noticeably.</w:t>
+      </w:r>
+    </w:p>
+    <w:p>
+      <w:pPr>
+        <w:pStyle w:val="ListBullet"/>
+      </w:pPr>
+      <w:r>
+        <w:rPr>
+          <w:b/>
+        </w:rPr>
+        <w:t xml:space="preserve">Shaft hardness: </w:t>
+      </w:r>
+      <w:r>
+        <w:t>Bronze bushes suit hardened shafts (about 300 HB or HRC 50 and above for heavy loads); softer shafts need softer bush alloys.</w:t>
+      </w:r>
+    </w:p>
+    <w:p>
+      <w:pPr>
+        <w:pStyle w:val="ListBullet"/>
+      </w:pPr>
+      <w:r>
+        <w:rPr>
+          <w:b/>
+        </w:rPr>
+        <w:t xml:space="preserve">Casting route: </w:t>
+      </w:r>
+      <w:r>
+        <w:t>Centrifugal and continuous casting give a denser structure than sand casting, and so better wear life.</w:t>
+      </w:r>
+    </w:p>
+    <w:p>
+      <w:pPr>
+        <w:pStyle w:val="ListBullet"/>
+      </w:pPr>
+      <w:r>
+        <w:rPr>
+          <w:b/>
+        </w:rPr>
+        <w:t xml:space="preserve">Lubrication: </w:t>
+      </w:r>
+      <w:r>
+        <w:t>Marginal or dry lubrication needs high-lead or graphite-plugged bronze; good oil film allows harder bronzes.</w:t>
+      </w:r>
+    </w:p>
+    <w:p>
+      <w:pPr>
+        <w:pStyle w:val="ListBullet"/>
+      </w:pPr>
+      <w:r>
+        <w:rPr>
+          <w:b/>
+        </w:rPr>
+        <w:t xml:space="preserve">Scrap recycling: </w:t>
+      </w:r>
+      <w:r>
+        <w:t>Mixed bronze scrap must be sorted and corrected to chemistry; spectrometer control is mandatory for bearing grades.</w:t>
+      </w:r>
+    </w:p>
+    <w:p>
+      <w:pPr>
+        <w:jc w:val="center"/>
+      </w:pPr>
+      <w:r>
+        <w:drawing>
+          <wp:inline xmlns:a="http://schemas.openxmlformats.org/drawingml/2006/main" xmlns:pic="http://schemas.openxmlformats.org/drawingml/2006/picture">
             <wp:extent cx="4937760" cy="2375715"/>
-            <wp:docPr id="4" name="Picture 4"/>
+            <wp:docPr id="6" name="Picture 6"/>
             <wp:cNvGraphicFramePr>
               <a:graphicFrameLocks noChangeAspect="1"/>
             </wp:cNvGraphicFramePr>
@@ -2128,7 +4124,7 @@
                     <pic:cNvPicPr/>
                   </pic:nvPicPr>
                   <pic:blipFill>
-                    <a:blip r:embed="rId12"/>
+                    <a:blip r:embed="rId14"/>
                     <a:stretch>
                       <a:fillRect/>
                     </a:stretch>
@@ -2156,7 +4152,7 @@
           <w:i/>
           <w:sz w:val="18"/>
         </w:rPr>
-        <w:t>Figure 4: Indicative cost structure (illustrative)</w:t>
+        <w:t>Figure 6: Indicative cost structure (illustrative)</w:t>
       </w:r>
     </w:p>
     <w:p>
@@ -2194,7 +4190,7 @@
         <w:drawing>
           <wp:inline xmlns:a="http://schemas.openxmlformats.org/drawingml/2006/main" xmlns:pic="http://schemas.openxmlformats.org/drawingml/2006/picture">
             <wp:extent cx="5852160" cy="3991087"/>
-            <wp:docPr id="5" name="Picture 5"/>
+            <wp:docPr id="7" name="Picture 7"/>
             <wp:cNvGraphicFramePr>
               <a:graphicFrameLocks noChangeAspect="1"/>
             </wp:cNvGraphicFramePr>
@@ -2206,7 +4202,7 @@
                     <pic:cNvPicPr/>
                   </pic:nvPicPr>
                   <pic:blipFill>
-                    <a:blip r:embed="rId13"/>
+                    <a:blip r:embed="rId15"/>
                     <a:stretch>
                       <a:fillRect/>
                     </a:stretch>
@@ -2234,7 +4230,7 @@
           <w:i/>
           <w:sz w:val="18"/>
         </w:rPr>
-        <w:t>Figure 5: Process flow for a cast bronze bush</w:t>
+        <w:t>Figure 7: Process flow for a cast bronze bush</w:t>
       </w:r>
     </w:p>
     <w:p>
@@ -2343,7 +4339,7 @@
         <w:drawing>
           <wp:inline xmlns:a="http://schemas.openxmlformats.org/drawingml/2006/main" xmlns:pic="http://schemas.openxmlformats.org/drawingml/2006/picture">
             <wp:extent cx="5303520" cy="2930122"/>
-            <wp:docPr id="6" name="Picture 6"/>
+            <wp:docPr id="8" name="Picture 8"/>
             <wp:cNvGraphicFramePr>
               <a:graphicFrameLocks noChangeAspect="1"/>
             </wp:cNvGraphicFramePr>
@@ -2355,7 +4351,7 @@
                     <pic:cNvPicPr/>
                   </pic:nvPicPr>
                   <pic:blipFill>
-                    <a:blip r:embed="rId14"/>
+                    <a:blip r:embed="rId16"/>
                     <a:stretch>
                       <a:fillRect/>
                     </a:stretch>
@@ -2383,7 +4379,7 @@
           <w:i/>
           <w:sz w:val="18"/>
         </w:rPr>
-        <w:t>Figure 6: Qualitative scoring of routes (intern judgement)</w:t>
+        <w:t>Figure 8: Qualitative scoring of routes (intern judgement)</w:t>
       </w:r>
     </w:p>
     <w:p>
@@ -2403,7 +4399,7 @@
           <w:b/>
           <w:sz w:val="18"/>
         </w:rPr>
-        <w:t>Table 5: Standards for bushes</w:t>
+        <w:t>Table 7: Standards for bushes</w:t>
       </w:r>
     </w:p>
     <w:tbl>
@@ -2709,7 +4705,7 @@
         <w:drawing>
           <wp:inline xmlns:a="http://schemas.openxmlformats.org/drawingml/2006/main" xmlns:pic="http://schemas.openxmlformats.org/drawingml/2006/picture">
             <wp:extent cx="5486400" cy="3095494"/>
-            <wp:docPr id="7" name="Picture 7"/>
+            <wp:docPr id="9" name="Picture 9"/>
             <wp:cNvGraphicFramePr>
               <a:graphicFrameLocks noChangeAspect="1"/>
             </wp:cNvGraphicFramePr>
@@ -2721,7 +4717,7 @@
                     <pic:cNvPicPr/>
                   </pic:nvPicPr>
                   <pic:blipFill>
-                    <a:blip r:embed="rId15"/>
+                    <a:blip r:embed="rId17"/>
                     <a:stretch>
                       <a:fillRect/>
                     </a:stretch>
@@ -2749,7 +4745,7 @@
           <w:i/>
           <w:sz w:val="18"/>
         </w:rPr>
-        <w:t>Figure 7: Global automotive bushing market</w:t>
+        <w:t>Figure 9: Global automotive bushing market</w:t>
       </w:r>
     </w:p>
     <w:p>
@@ -2760,7 +4756,7 @@
         <w:drawing>
           <wp:inline xmlns:a="http://schemas.openxmlformats.org/drawingml/2006/main" xmlns:pic="http://schemas.openxmlformats.org/drawingml/2006/picture">
             <wp:extent cx="5486400" cy="3095494"/>
-            <wp:docPr id="8" name="Picture 8"/>
+            <wp:docPr id="10" name="Picture 10"/>
             <wp:cNvGraphicFramePr>
               <a:graphicFrameLocks noChangeAspect="1"/>
             </wp:cNvGraphicFramePr>
@@ -2772,7 +4768,7 @@
                     <pic:cNvPicPr/>
                   </pic:nvPicPr>
                   <pic:blipFill>
-                    <a:blip r:embed="rId16"/>
+                    <a:blip r:embed="rId18"/>
                     <a:stretch>
                       <a:fillRect/>
                     </a:stretch>
@@ -2800,7 +4796,7 @@
           <w:i/>
           <w:sz w:val="18"/>
         </w:rPr>
-        <w:t>Figure 8: India automotive bearing market, a proxy for bush demand</w:t>
+        <w:t>Figure 10: India automotive bearing market, a proxy for bush demand</w:t>
       </w:r>
     </w:p>
     <w:p>
@@ -2809,7 +4805,7 @@
           <w:b/>
           <w:sz w:val="18"/>
         </w:rPr>
-        <w:t>Table 6: Published figures used as proxies</w:t>
+        <w:t>Table 8: Published figures used as proxies</w:t>
       </w:r>
     </w:p>
     <w:tbl>
@@ -3177,7 +5173,7 @@
           <w:b/>
           <w:sz w:val="18"/>
         </w:rPr>
-        <w:t>Table 7: Method for building an addressable market (inputs to be validated)</w:t>
+        <w:t>Table 9: Method for building an addressable market (inputs to be validated)</w:t>
       </w:r>
     </w:p>
     <w:tbl>
@@ -3412,7 +5408,7 @@
         <w:drawing>
           <wp:inline xmlns:a="http://schemas.openxmlformats.org/drawingml/2006/main" xmlns:pic="http://schemas.openxmlformats.org/drawingml/2006/picture">
             <wp:extent cx="4572000" cy="3036013"/>
-            <wp:docPr id="9" name="Picture 9"/>
+            <wp:docPr id="11" name="Picture 11"/>
             <wp:cNvGraphicFramePr>
               <a:graphicFrameLocks noChangeAspect="1"/>
             </wp:cNvGraphicFramePr>
@@ -3424,7 +5420,7 @@
                     <pic:cNvPicPr/>
                   </pic:nvPicPr>
                   <pic:blipFill>
-                    <a:blip r:embed="rId17"/>
+                    <a:blip r:embed="rId19"/>
                     <a:stretch>
                       <a:fillRect/>
                     </a:stretch>
@@ -3452,7 +5448,7 @@
           <w:i/>
           <w:sz w:val="18"/>
         </w:rPr>
-        <w:t>Figure 9: Indicative end-use split (intern estimate)</w:t>
+        <w:t>Figure 11: Indicative end-use split (intern estimate)</w:t>
       </w:r>
     </w:p>
     <w:p>
@@ -3555,7 +5551,7 @@
         <w:drawing>
           <wp:inline xmlns:a="http://schemas.openxmlformats.org/drawingml/2006/main" xmlns:pic="http://schemas.openxmlformats.org/drawingml/2006/picture">
             <wp:extent cx="4937760" cy="2906590"/>
-            <wp:docPr id="10" name="Picture 10"/>
+            <wp:docPr id="12" name="Picture 12"/>
             <wp:cNvGraphicFramePr>
               <a:graphicFrameLocks noChangeAspect="1"/>
             </wp:cNvGraphicFramePr>
@@ -3567,7 +5563,7 @@
                     <pic:cNvPicPr/>
                   </pic:nvPicPr>
                   <pic:blipFill>
-                    <a:blip r:embed="rId18"/>
+                    <a:blip r:embed="rId20"/>
                     <a:stretch>
                       <a:fillRect/>
                     </a:stretch>
@@ -3595,7 +5591,7 @@
           <w:i/>
           <w:sz w:val="18"/>
         </w:rPr>
-        <w:t>Figure 10: Indicative channel mix (illustrative)</w:t>
+        <w:t>Figure 12: Indicative channel mix (illustrative)</w:t>
       </w:r>
     </w:p>
     <w:p>
@@ -3604,7 +5600,7 @@
           <w:b/>
           <w:sz w:val="18"/>
         </w:rPr>
-        <w:t>Table 8: B2B vs B2C comparison for bushes</w:t>
+        <w:t>Table 10: B2B vs B2C comparison for bushes</w:t>
       </w:r>
     </w:p>
     <w:tbl>
@@ -4046,7 +6042,7 @@
         <w:drawing>
           <wp:inline xmlns:a="http://schemas.openxmlformats.org/drawingml/2006/main" xmlns:pic="http://schemas.openxmlformats.org/drawingml/2006/picture">
             <wp:extent cx="5120640" cy="2753032"/>
-            <wp:docPr id="11" name="Picture 11"/>
+            <wp:docPr id="13" name="Picture 13"/>
             <wp:cNvGraphicFramePr>
               <a:graphicFrameLocks noChangeAspect="1"/>
             </wp:cNvGraphicFramePr>
@@ -4058,7 +6054,7 @@
                     <pic:cNvPicPr/>
                   </pic:nvPicPr>
                   <pic:blipFill>
-                    <a:blip r:embed="rId19"/>
+                    <a:blip r:embed="rId21"/>
                     <a:stretch>
                       <a:fillRect/>
                     </a:stretch>
@@ -4086,7 +6082,7 @@
           <w:i/>
           <w:sz w:val="18"/>
         </w:rPr>
-        <w:t>Figure 11: Illustrative channel growth (aftermarket and online faster than OEM)</w:t>
+        <w:t>Figure 13: Illustrative channel growth (aftermarket and online faster than OEM)</w:t>
       </w:r>
     </w:p>
     <w:p>
@@ -4106,7 +6102,7 @@
           <w:b/>
           <w:sz w:val="18"/>
         </w:rPr>
-        <w:t>Table 9: Competitive landscape (names for orientation only)</w:t>
+        <w:t>Table 11: Competitive landscape (names for orientation only)</w:t>
       </w:r>
     </w:p>
     <w:tbl>
@@ -4355,7 +6351,7 @@
           <w:b/>
           <w:sz w:val="18"/>
         </w:rPr>
-        <w:t>Table 10: Indicative roadmap</w:t>
+        <w:t>Table 12: Indicative roadmap</w:t>
       </w:r>
     </w:p>
     <w:tbl>

</xml_diff>